<commit_message>
feat: GBU-aware Signer selection + UI improvements
- processor: merge Chicony (and any multi-Signer supplier) by GBU suffix
  (cNB/bNB->NB, cDT/bDT->DT) so correct Signer is picked automatically
- processor: NaT-safe format_date (returns empty string instead of crashing)
- ui: all 9 placeholder fields required; disabled rows show missing field names in log
- ui: switch to CTkCheckBox for alignment, CTkLabel for all row text (DPI-safe)
- ui: Effective Date column added to table; window width 1000px
- ui: canvas+scrollbar scroll area (no private CTk attributes)
- ui: English status labels; sort order Pending->Missing->Generated
- loader: truncate Info sheet columns after Address
- README: updated with Signer logic, required fields, GUI usage
</commit_message>
<xml_diff>
--- a/template/Settlement Form_Draft.docx
+++ b/template/Settlement Form_Draft.docx
@@ -77,7 +77,6 @@
       <w:r>
         <w:rPr>
           <w:rFonts w:hint="eastAsia"/>
-          <w:highlight w:val="yellow"/>
           <w:lang w:eastAsia="zh-TW"/>
         </w:rPr>
         <w:t>&lt;</w:t>
@@ -85,7 +84,6 @@
       <w:r>
         <w:rPr>
           <w:rFonts w:hint="eastAsia"/>
-          <w:highlight w:val="yellow"/>
           <w:lang w:eastAsia="zh-TW"/>
         </w:rPr>
         <w:t>Supplier</w:t>
@@ -93,7 +91,6 @@
       <w:r>
         <w:rPr>
           <w:rFonts w:hint="eastAsia"/>
-          <w:highlight w:val="yellow"/>
           <w:lang w:eastAsia="zh-TW"/>
         </w:rPr>
         <w:t xml:space="preserve"> </w:t>
@@ -101,7 +98,6 @@
       <w:r>
         <w:rPr>
           <w:rFonts w:hint="eastAsia"/>
-          <w:highlight w:val="yellow"/>
           <w:lang w:eastAsia="zh-TW"/>
         </w:rPr>
         <w:t>N</w:t>
@@ -109,7 +105,6 @@
       <w:r>
         <w:rPr>
           <w:rFonts w:hint="eastAsia"/>
-          <w:highlight w:val="yellow"/>
           <w:lang w:eastAsia="zh-TW"/>
         </w:rPr>
         <w:t>ame&gt;</w:t>
@@ -117,7 +112,6 @@
       <w:r>
         <w:rPr>
           <w:rFonts w:hint="eastAsia"/>
-          <w:highlight w:val="yellow"/>
           <w:lang w:eastAsia="zh-TW"/>
         </w:rPr>
         <w:t xml:space="preserve"> </w:t>
@@ -146,7 +140,6 @@
       <w:r>
         <w:rPr>
           <w:rFonts w:hint="eastAsia"/>
-          <w:highlight w:val="yellow"/>
           <w:lang w:eastAsia="zh-TW"/>
         </w:rPr>
         <w:t xml:space="preserve">&lt;Master </w:t>
@@ -154,7 +147,6 @@
       <w:r>
         <w:rPr>
           <w:rFonts w:hint="eastAsia"/>
-          <w:highlight w:val="yellow"/>
           <w:lang w:eastAsia="zh-TW"/>
         </w:rPr>
         <w:t>A</w:t>
@@ -162,7 +154,6 @@
       <w:r>
         <w:rPr>
           <w:rFonts w:hint="eastAsia"/>
-          <w:highlight w:val="yellow"/>
           <w:lang w:eastAsia="zh-TW"/>
         </w:rPr>
         <w:t>greement&gt;</w:t>
@@ -179,7 +170,6 @@
       <w:r>
         <w:rPr>
           <w:rFonts w:hint="eastAsia"/>
-          <w:highlight w:val="yellow"/>
           <w:lang w:eastAsia="zh-TW"/>
         </w:rPr>
         <w:t xml:space="preserve">&lt;Effective </w:t>
@@ -187,7 +177,6 @@
       <w:r>
         <w:rPr>
           <w:rFonts w:hint="eastAsia"/>
-          <w:highlight w:val="yellow"/>
           <w:lang w:eastAsia="zh-TW"/>
         </w:rPr>
         <w:t>Date</w:t>
@@ -195,7 +184,6 @@
       <w:r>
         <w:rPr>
           <w:rFonts w:hint="eastAsia"/>
-          <w:highlight w:val="yellow"/>
           <w:lang w:eastAsia="zh-TW"/>
         </w:rPr>
         <w:t>&gt;</w:t>
@@ -203,7 +191,6 @@
       <w:r>
         <w:rPr>
           <w:rFonts w:hint="eastAsia"/>
-          <w:highlight w:val="yellow"/>
           <w:lang w:eastAsia="zh-TW"/>
         </w:rPr>
         <w:t xml:space="preserve"> </w:t>
@@ -363,7 +350,6 @@
         <w:rPr>
           <w:rFonts w:hint="eastAsia"/>
           <w:sz w:val="20"/>
-          <w:highlight w:val="yellow"/>
         </w:rPr>
         <w:t>&lt;Supplier Name&gt;</w:t>
       </w:r>
@@ -414,12 +400,21 @@
           <w:sz w:val="20"/>
         </w:rPr>
       </w:pPr>
+      <w:proofErr w:type="gramStart"/>
       <w:r>
         <w:rPr>
           <w:sz w:val="20"/>
           <w:u w:val="single"/>
         </w:rPr>
-        <w:t>Detail of Reconciled Matters</w:t>
+        <w:t>Detail</w:t>
+      </w:r>
+      <w:proofErr w:type="gramEnd"/>
+      <w:r>
+        <w:rPr>
+          <w:sz w:val="20"/>
+          <w:u w:val="single"/>
+        </w:rPr>
+        <w:t xml:space="preserve"> of Reconciled Matters</w:t>
       </w:r>
       <w:r>
         <w:rPr>
@@ -447,14 +442,12 @@
       <w:r>
         <w:rPr>
           <w:rFonts w:hint="eastAsia"/>
-          <w:highlight w:val="yellow"/>
           <w:lang w:eastAsia="zh-TW"/>
         </w:rPr>
         <w:t>&lt;</w:t>
       </w:r>
       <w:r>
         <w:rPr>
-          <w:highlight w:val="yellow"/>
           <w:lang w:eastAsia="zh-TW"/>
         </w:rPr>
         <w:t>Sub-Category</w:t>
@@ -462,7 +455,6 @@
       <w:r>
         <w:rPr>
           <w:rFonts w:hint="eastAsia"/>
-          <w:highlight w:val="yellow"/>
           <w:lang w:eastAsia="zh-TW"/>
         </w:rPr>
         <w:t>&gt;</w:t>
@@ -487,7 +479,6 @@
       <w:r>
         <w:rPr>
           <w:rFonts w:hint="eastAsia"/>
-          <w:highlight w:val="yellow"/>
           <w:lang w:eastAsia="zh-TW"/>
         </w:rPr>
         <w:t>&lt;Platform&gt;</w:t>
@@ -563,14 +554,12 @@
       <w:r>
         <w:rPr>
           <w:rFonts w:hint="eastAsia"/>
-          <w:highlight w:val="yellow"/>
           <w:lang w:eastAsia="zh-TW"/>
         </w:rPr>
         <w:t>&lt;</w:t>
       </w:r>
       <w:r>
         <w:rPr>
-          <w:highlight w:val="yellow"/>
           <w:lang w:eastAsia="zh-TW"/>
         </w:rPr>
         <w:t>Sub-Category</w:t>
@@ -578,7 +567,6 @@
       <w:r>
         <w:rPr>
           <w:rFonts w:hint="eastAsia"/>
-          <w:highlight w:val="yellow"/>
           <w:lang w:eastAsia="zh-TW"/>
         </w:rPr>
         <w:t>&gt;</w:t>
@@ -589,7 +577,6 @@
       <w:r>
         <w:rPr>
           <w:rFonts w:hint="eastAsia"/>
-          <w:highlight w:val="yellow"/>
           <w:lang w:eastAsia="zh-TW"/>
         </w:rPr>
         <w:t>&lt;Platform&gt;</w:t>
@@ -704,14 +691,12 @@
             <w:r>
               <w:rPr>
                 <w:rFonts w:hint="eastAsia"/>
-                <w:highlight w:val="yellow"/>
                 <w:lang w:eastAsia="zh-TW"/>
               </w:rPr>
               <w:t>&lt;</w:t>
             </w:r>
             <w:r>
               <w:rPr>
-                <w:highlight w:val="yellow"/>
                 <w:lang w:eastAsia="zh-TW"/>
               </w:rPr>
               <w:t>Sub-Category</w:t>
@@ -719,7 +704,6 @@
             <w:r>
               <w:rPr>
                 <w:rFonts w:hint="eastAsia"/>
-                <w:highlight w:val="yellow"/>
                 <w:lang w:eastAsia="zh-TW"/>
               </w:rPr>
               <w:t>&gt;</w:t>
@@ -727,7 +711,6 @@
             <w:r>
               <w:rPr>
                 <w:rFonts w:hint="eastAsia"/>
-                <w:highlight w:val="yellow"/>
                 <w:lang w:eastAsia="zh-TW"/>
               </w:rPr>
               <w:t xml:space="preserve"> </w:t>
@@ -741,7 +724,6 @@
             <w:r>
               <w:rPr>
                 <w:rFonts w:hint="eastAsia"/>
-                <w:highlight w:val="yellow"/>
                 <w:lang w:eastAsia="zh-TW"/>
               </w:rPr>
               <w:t>&lt;Platform&gt;</w:t>
@@ -777,14 +759,12 @@
             <w:r>
               <w:rPr>
                 <w:rFonts w:hint="eastAsia"/>
-                <w:highlight w:val="yellow"/>
                 <w:lang w:eastAsia="zh-TW"/>
               </w:rPr>
               <w:t>&lt;</w:t>
             </w:r>
             <w:r>
               <w:rPr>
-                <w:highlight w:val="yellow"/>
                 <w:lang w:eastAsia="zh-TW"/>
               </w:rPr>
               <w:t>Sub-Category</w:t>
@@ -792,7 +772,6 @@
             <w:r>
               <w:rPr>
                 <w:rFonts w:hint="eastAsia"/>
-                <w:highlight w:val="yellow"/>
                 <w:lang w:eastAsia="zh-TW"/>
               </w:rPr>
               <w:t>&gt;</w:t>
@@ -813,7 +792,6 @@
             <w:r>
               <w:rPr>
                 <w:rFonts w:hint="eastAsia"/>
-                <w:highlight w:val="yellow"/>
                 <w:lang w:eastAsia="zh-TW"/>
               </w:rPr>
               <w:t>&lt;Platform&gt;</w:t>
@@ -837,14 +815,12 @@
             <w:r>
               <w:rPr>
                 <w:rFonts w:hint="eastAsia"/>
-                <w:highlight w:val="yellow"/>
                 <w:lang w:eastAsia="zh-TW"/>
               </w:rPr>
               <w:t>&lt;</w:t>
             </w:r>
             <w:r>
               <w:rPr>
-                <w:highlight w:val="yellow"/>
                 <w:lang w:eastAsia="zh-TW"/>
               </w:rPr>
               <w:t>Actual Payment</w:t>
@@ -852,7 +828,6 @@
             <w:r>
               <w:rPr>
                 <w:rFonts w:hint="eastAsia"/>
-                <w:highlight w:val="yellow"/>
                 <w:lang w:eastAsia="zh-TW"/>
               </w:rPr>
               <w:t>&gt;</w:t>
@@ -872,14 +847,12 @@
             <w:r>
               <w:rPr>
                 <w:rFonts w:hint="eastAsia"/>
-                <w:highlight w:val="yellow"/>
                 <w:lang w:eastAsia="zh-TW"/>
               </w:rPr>
               <w:t>&lt;</w:t>
             </w:r>
             <w:r>
               <w:rPr>
-                <w:highlight w:val="yellow"/>
                 <w:lang w:eastAsia="zh-TW"/>
               </w:rPr>
               <w:t>Sub-Category</w:t>
@@ -887,7 +860,6 @@
             <w:r>
               <w:rPr>
                 <w:rFonts w:hint="eastAsia"/>
-                <w:highlight w:val="yellow"/>
                 <w:lang w:eastAsia="zh-TW"/>
               </w:rPr>
               <w:t>&gt;</w:t>
@@ -896,15 +868,11 @@
               <w:t xml:space="preserve"> </w:t>
             </w:r>
             <w:r>
-              <w:t>/</w:t>
-            </w:r>
-            <w:r>
-              <w:t xml:space="preserve"> </w:t>
+              <w:t xml:space="preserve">/ </w:t>
             </w:r>
             <w:r>
               <w:rPr>
                 <w:rFonts w:hint="eastAsia"/>
-                <w:highlight w:val="yellow"/>
                 <w:lang w:eastAsia="zh-TW"/>
               </w:rPr>
               <w:t>&lt;Platform&gt;</w:t>
@@ -940,14 +908,12 @@
             <w:r>
               <w:rPr>
                 <w:rFonts w:hint="eastAsia"/>
-                <w:highlight w:val="yellow"/>
                 <w:lang w:eastAsia="zh-TW"/>
               </w:rPr>
               <w:t>&lt;</w:t>
             </w:r>
             <w:r>
               <w:rPr>
-                <w:highlight w:val="yellow"/>
                 <w:lang w:eastAsia="zh-TW"/>
               </w:rPr>
               <w:t>Sub-Category</w:t>
@@ -955,7 +921,6 @@
             <w:r>
               <w:rPr>
                 <w:rFonts w:hint="eastAsia"/>
-                <w:highlight w:val="yellow"/>
                 <w:lang w:eastAsia="zh-TW"/>
               </w:rPr>
               <w:t>&gt;</w:t>
@@ -964,15 +929,11 @@
               <w:t xml:space="preserve"> </w:t>
             </w:r>
             <w:r>
-              <w:t>/</w:t>
-            </w:r>
-            <w:r>
-              <w:t xml:space="preserve"> </w:t>
+              <w:t xml:space="preserve">/ </w:t>
             </w:r>
             <w:r>
               <w:rPr>
                 <w:rFonts w:hint="eastAsia"/>
-                <w:highlight w:val="yellow"/>
                 <w:lang w:eastAsia="zh-TW"/>
               </w:rPr>
               <w:t>&lt;Platform&gt;</w:t>
@@ -1008,14 +969,12 @@
             <w:r>
               <w:rPr>
                 <w:rFonts w:hint="eastAsia"/>
-                <w:highlight w:val="yellow"/>
                 <w:lang w:eastAsia="zh-TW"/>
               </w:rPr>
               <w:t>&lt;</w:t>
             </w:r>
             <w:r>
               <w:rPr>
-                <w:highlight w:val="yellow"/>
                 <w:lang w:eastAsia="zh-TW"/>
               </w:rPr>
               <w:t>Sub-Category</w:t>
@@ -1023,7 +982,6 @@
             <w:r>
               <w:rPr>
                 <w:rFonts w:hint="eastAsia"/>
-                <w:highlight w:val="yellow"/>
                 <w:lang w:eastAsia="zh-TW"/>
               </w:rPr>
               <w:t>&gt;</w:t>
@@ -1040,7 +998,6 @@
             <w:r>
               <w:rPr>
                 <w:rFonts w:hint="eastAsia"/>
-                <w:highlight w:val="yellow"/>
                 <w:lang w:eastAsia="zh-TW"/>
               </w:rPr>
               <w:t>&lt;Platform&gt;</w:t>
@@ -1049,7 +1006,15 @@
               <w:t xml:space="preserve"> </w:t>
             </w:r>
             <w:r>
-              <w:t>or other specific name for] NRE</w:t>
+              <w:t xml:space="preserve">or </w:t>
+            </w:r>
+            <w:proofErr w:type="gramStart"/>
+            <w:r>
+              <w:t>other</w:t>
+            </w:r>
+            <w:proofErr w:type="gramEnd"/>
+            <w:r>
+              <w:t xml:space="preserve"> specific name for] NRE</w:t>
             </w:r>
           </w:p>
         </w:tc>
@@ -1079,14 +1044,12 @@
             <w:r>
               <w:rPr>
                 <w:rFonts w:hint="eastAsia"/>
-                <w:highlight w:val="yellow"/>
                 <w:lang w:eastAsia="zh-TW"/>
               </w:rPr>
               <w:t>&lt;</w:t>
             </w:r>
             <w:r>
               <w:rPr>
-                <w:highlight w:val="yellow"/>
                 <w:lang w:eastAsia="zh-TW"/>
               </w:rPr>
               <w:t>Sub-Category</w:t>
@@ -1094,7 +1057,6 @@
             <w:r>
               <w:rPr>
                 <w:rFonts w:hint="eastAsia"/>
-                <w:highlight w:val="yellow"/>
                 <w:lang w:eastAsia="zh-TW"/>
               </w:rPr>
               <w:t>&gt;</w:t>
@@ -1111,7 +1073,6 @@
             <w:r>
               <w:rPr>
                 <w:rFonts w:hint="eastAsia"/>
-                <w:highlight w:val="yellow"/>
                 <w:lang w:eastAsia="zh-TW"/>
               </w:rPr>
               <w:t>&lt;Platform&gt;</w:t>
@@ -1171,14 +1132,12 @@
             <w:r>
               <w:rPr>
                 <w:rFonts w:hint="eastAsia"/>
-                <w:highlight w:val="yellow"/>
                 <w:lang w:eastAsia="zh-TW"/>
               </w:rPr>
               <w:t>&lt;</w:t>
             </w:r>
             <w:r>
               <w:rPr>
-                <w:highlight w:val="yellow"/>
                 <w:lang w:eastAsia="zh-TW"/>
               </w:rPr>
               <w:t>Actual Payment</w:t>
@@ -1186,7 +1145,6 @@
             <w:r>
               <w:rPr>
                 <w:rFonts w:hint="eastAsia"/>
-                <w:highlight w:val="yellow"/>
                 <w:lang w:eastAsia="zh-TW"/>
               </w:rPr>
               <w:t>&gt;</w:t>
@@ -1298,10 +1256,9 @@
         <w:rPr>
           <w:rFonts w:hint="eastAsia"/>
           <w:sz w:val="20"/>
-          <w:highlight w:val="yellow"/>
           <w:lang w:eastAsia="zh-TW"/>
         </w:rPr>
-        <w:t>&lt;Capital Money Letter&gt;</w:t>
+        <w:t xml:space="preserve">&lt;Capital Money Letter&gt; </w:t>
       </w:r>
       <w:r>
         <w:rPr>
@@ -1309,53 +1266,34 @@
           <w:sz w:val="20"/>
           <w:lang w:eastAsia="zh-TW"/>
         </w:rPr>
-        <w:t xml:space="preserve"> </w:t>
-      </w:r>
-      <w:r>
-        <w:rPr>
-          <w:rFonts w:hint="eastAsia"/>
-          <w:sz w:val="20"/>
-          <w:lang w:eastAsia="zh-TW"/>
-        </w:rPr>
         <w:t>(</w:t>
-      </w:r>
-      <w:r>
-        <w:rPr>
-          <w:rFonts w:hint="eastAsia"/>
-          <w:highlight w:val="yellow"/>
-          <w:lang w:eastAsia="zh-TW"/>
-        </w:rPr>
-        <w:t>&lt;</w:t>
-      </w:r>
-      <w:r>
-        <w:rPr>
-          <w:highlight w:val="yellow"/>
-          <w:lang w:eastAsia="zh-TW"/>
-        </w:rPr>
-        <w:t xml:space="preserve">Actual </w:t>
-      </w:r>
-      <w:r>
-        <w:rPr>
-          <w:rFonts w:hint="eastAsia"/>
-          <w:highlight w:val="yellow"/>
-          <w:lang w:eastAsia="zh-TW"/>
-        </w:rPr>
-        <w:t>Payment</w:t>
-      </w:r>
-      <w:r>
-        <w:rPr>
-          <w:rFonts w:hint="eastAsia"/>
-          <w:highlight w:val="yellow"/>
-          <w:lang w:eastAsia="zh-TW"/>
-        </w:rPr>
-        <w:t>&gt;</w:t>
       </w:r>
       <w:r>
         <w:rPr>
           <w:rFonts w:hint="eastAsia"/>
           <w:lang w:eastAsia="zh-TW"/>
         </w:rPr>
-        <w:t xml:space="preserve">) </w:t>
+        <w:t>&lt;</w:t>
+      </w:r>
+      <w:r>
+        <w:rPr>
+          <w:lang w:eastAsia="zh-TW"/>
+        </w:rPr>
+        <w:t xml:space="preserve">Actual </w:t>
+      </w:r>
+      <w:r>
+        <w:rPr>
+          <w:rFonts w:hint="eastAsia"/>
+          <w:lang w:eastAsia="zh-TW"/>
+        </w:rPr>
+        <w:t>Payment</w:t>
+      </w:r>
+      <w:r>
+        <w:rPr>
+          <w:rFonts w:hint="eastAsia"/>
+          <w:lang w:eastAsia="zh-TW"/>
+        </w:rPr>
+        <w:t xml:space="preserve">&gt;) </w:t>
       </w:r>
       <w:r>
         <w:rPr>
@@ -1551,17 +1489,9 @@
                 <w:rFonts w:hint="eastAsia"/>
                 <w:b/>
                 <w:bCs/>
-                <w:highlight w:val="yellow"/>
                 <w:lang w:eastAsia="zh-TW"/>
               </w:rPr>
               <w:t>&lt;Supplier Name&gt;</w:t>
-            </w:r>
-            <w:r>
-              <w:rPr>
-                <w:rFonts w:hint="eastAsia"/>
-                <w:lang w:eastAsia="zh-TW"/>
-              </w:rPr>
-              <w:t>&lt;bold&gt;</w:t>
             </w:r>
           </w:p>
         </w:tc>
@@ -1769,7 +1699,6 @@
             <w:r>
               <w:rPr>
                 <w:rFonts w:hint="eastAsia"/>
-                <w:highlight w:val="yellow"/>
                 <w:lang w:eastAsia="zh-TW"/>
               </w:rPr>
               <w:t>&lt;Signer&gt;</w:t>
@@ -1881,7 +1810,6 @@
             <w:r>
               <w:rPr>
                 <w:rFonts w:hint="eastAsia"/>
-                <w:highlight w:val="yellow"/>
                 <w:lang w:eastAsia="zh-TW"/>
               </w:rPr>
               <w:t>&lt;Title&gt;</w:t>

</xml_diff>